<commit_message>
Regenerate capability Excel and Word docs from live registries.
Co-authored-by: Cursor <cursoragent@cursor.com>
</commit_message>
<xml_diff>
--- a/docs/KPI-Engine-Design-Document.docx
+++ b/docs/KPI-Engine-Design-Document.docx
@@ -67,7 +67,7 @@
         <w:pStyle w:val="ListBullet"/>
       </w:pPr>
       <w:r>
-        <w:t>One generic entry point (udfs.kpi_engine.main) serves every KPI; routing is by kpi_id.</w:t>
+        <w:t>One generic entry point (kpi_engine.main) serves every KPI; routing is by kpi_id.</w:t>
       </w:r>
     </w:p>
     <w:p>
@@ -303,7 +303,7 @@
         <w:pStyle w:val="ListNumber"/>
       </w:pPr>
       <w:r>
-        <w:t>Catalog freeze — New reusable names go to capabilities/ + registries/; core/ is not edited for new KPIs.</w:t>
+        <w:t>Catalog freeze — New reusable names go to capabilities/ + registries/; pipeline/ is not edited for new KPIs.</w:t>
       </w:r>
     </w:p>
     <w:p>
@@ -549,7 +549,7 @@
         <w:pStyle w:val="ListNumber"/>
       </w:pPr>
       <w:r>
-        <w:t>Bind KPI YAML — load config/kpis/&lt;kpi_id&gt;.yaml; resolve parameters and grain overlay.</w:t>
+        <w:t>Bind KPI YAML — load kpi_config/kpis/&lt;kpi_id&gt;.yaml; resolve parameters and grain overlay.</w:t>
       </w:r>
     </w:p>
     <w:p>
@@ -597,7 +597,7 @@
         <w:pStyle w:val="ListBullet"/>
       </w:pPr>
       <w:r>
-        <w:t>Entry: udfs.kpi_engine.main(context) → compute(context) → JSON.</w:t>
+        <w:t>Entry: kpi_engine.main(context) → compute(context) → JSON.</w:t>
       </w:r>
     </w:p>
     <w:p>
@@ -605,7 +605,7 @@
         <w:pStyle w:val="ListBullet"/>
       </w:pPr>
       <w:r>
-        <w:t>Host sets udf.module_path to udfs.kpi_engine.main for all KPIs.</w:t>
+        <w:t>Host sets udf.module_path to kpi_engine.main for all KPIs.</w:t>
       </w:r>
     </w:p>
     <w:p>
@@ -613,7 +613,7 @@
         <w:pStyle w:val="ListBullet"/>
       </w:pPr>
       <w:r>
-        <w:t>Copy udfs/kpi_engine/ + udfs/config/ into the platform image or volume.</w:t>
+        <w:t>Copy kpi_engine/ + kpi_config/ into the platform image or volume, or set KPI_ENGINE_CONFIG_DIR.</w:t>
       </w:r>
     </w:p>
     <w:p>
@@ -661,7 +661,7 @@
         <w:pStyle w:val="ListBullet"/>
       </w:pPr>
       <w:r>
-        <w:t>`point`, `window`, `trend`, `arithmetic`, `fn`, `expr`, `constant`, `dimension`</w:t>
+        <w:t>`point`, `window`, `trend`, `trend_arithmetic`, `arithmetic`, `fn`, `expr`, `constant`</w:t>
       </w:r>
     </w:p>
     <w:p>
@@ -669,7 +669,7 @@
         <w:pStyle w:val="ListBullet"/>
       </w:pPr>
       <w:r>
-        <w:t>`predicate`, `hook`, `rank`, `percent_of_total`, `ntile`, `dense_rank`, `row_number`, `cumulative_share`</w:t>
+        <w:t>`dimension`, `predicate`, `hook`, `rank`, `percent_of_total`, `ntile`, `dense_rank`, `row_number`</w:t>
       </w:r>
     </w:p>
     <w:p>
@@ -677,7 +677,7 @@
         <w:pStyle w:val="ListBullet"/>
       </w:pPr>
       <w:r>
-        <w:t>`running_total`, `contribution`, `lag`, `lead`, `index`, `vs_target`, `threshold`, `percent_rank`</w:t>
+        <w:t>`cumulative_share`, `running_total`, `contribution`, `lag`, `lead`, `index`, `vs_target`, `threshold`</w:t>
       </w:r>
     </w:p>
     <w:p>
@@ -685,7 +685,39 @@
         <w:pStyle w:val="ListBullet"/>
       </w:pPr>
       <w:r>
-        <w:t>`gap_to_leader`, `gap_to_avg`, `zscore`, `running_avg`, `top_n`, `diff`, `pct_change`</w:t>
+        <w:t>`percent_rank`, `gap_to_leader`, `gap_to_avg`, `zscore`, `running_avg`, `top_n`, `diff`, `pct_change`</w:t>
+      </w:r>
+    </w:p>
+    <w:p>
+      <w:pPr>
+        <w:pStyle w:val="ListBullet"/>
+      </w:pPr>
+      <w:r>
+        <w:t>`compare`, `filtered_point`, `filtered_window`, `filtered_trend`, `filtered_compare`, `expanding_window`, `shifted_trend`, `rate`</w:t>
+      </w:r>
+    </w:p>
+    <w:p>
+      <w:pPr>
+        <w:pStyle w:val="ListBullet"/>
+      </w:pPr>
+      <w:r>
+        <w:t>`cumulative_point`, `n_period_avg`, `weighted_window`, `snapshot_compare`, `bottom_n`, `rank_pct_change`, `concentration`, `abc_class`</w:t>
+      </w:r>
+    </w:p>
+    <w:p>
+      <w:pPr>
+        <w:pStyle w:val="ListBullet"/>
+      </w:pPr>
+      <w:r>
+        <w:t>`pareto_flag`, `normalize`, `annualize`, `vs_prior_window`, `delta_contribution`, `baseline_index`, `band`, `envelope`</w:t>
+      </w:r>
+    </w:p>
+    <w:p>
+      <w:pPr>
+        <w:pStyle w:val="ListBullet"/>
+      </w:pPr>
+      <w:r>
+        <w:t>`compound_growth`, `seasonal_adjust`</w:t>
       </w:r>
     </w:p>
     <w:p>
@@ -725,7 +757,23 @@
         <w:pStyle w:val="ListBullet"/>
       </w:pPr>
       <w:r>
-        <w:t>`sqrt`, `date_diff`, `date_add`, `epoch_day`</w:t>
+        <w:t>`sqrt`, `date_diff`, `date_add`, `epoch_day`, `weighted_product`, `safe_divide`, `clip`, `parse_date`</w:t>
+      </w:r>
+    </w:p>
+    <w:p>
+      <w:pPr>
+        <w:pStyle w:val="ListBullet"/>
+      </w:pPr>
+      <w:r>
+        <w:t>`parse_number`, `trim`, `upper`, `lower`, `substring`, `left`, `right`, `replace`</w:t>
+      </w:r>
+    </w:p>
+    <w:p>
+      <w:pPr>
+        <w:pStyle w:val="ListBullet"/>
+      </w:pPr>
+      <w:r>
+        <w:t>`concat`, `hash_bucket`, `json_extract`, `coalesce_date`, `is_between_dates`, `flag_in_set`</w:t>
       </w:r>
     </w:p>
     <w:p>
@@ -765,7 +813,23 @@
         <w:pStyle w:val="ListBullet"/>
       </w:pPr>
       <w:r>
-        <w:t>`power`, `log`, `log10`, `sqrt`, `date_diff`, `date_add`, `epoch_day`</w:t>
+        <w:t>`power`, `log`, `log10`, `sqrt`, `date_diff`, `date_add`, `epoch_day`, `geomean_scalars`</w:t>
+      </w:r>
+    </w:p>
+    <w:p>
+      <w:pPr>
+        <w:pStyle w:val="ListBullet"/>
+      </w:pPr>
+      <w:r>
+        <w:t>`weighted_avg_scalars`, `harmonic_mean`, `min_max_spread`, `ratio_safe`, `bps_change`, `log_change`, `if_between`, `all_null`</w:t>
+      </w:r>
+    </w:p>
+    <w:p>
+      <w:pPr>
+        <w:pStyle w:val="ListBullet"/>
+      </w:pPr>
+      <w:r>
+        <w:t>`any_null`</w:t>
       </w:r>
     </w:p>
     <w:p>
@@ -797,7 +861,23 @@
         <w:pStyle w:val="ListBullet"/>
       </w:pPr>
       <w:r>
-        <w:t>`longest_streak`, `cagr`, `slope`</w:t>
+        <w:t>`longest_streak`, `cagr`, `slope`, `mad`, `projection`, `autocorrelation`, `rsi`, `bollinger`</w:t>
+      </w:r>
+    </w:p>
+    <w:p>
+      <w:pPr>
+        <w:pStyle w:val="ListBullet"/>
+      </w:pPr>
+      <w:r>
+        <w:t>`exponential_decay_sum`, `theil_sen_slope`, `changepoint`, `outlier_count`, `percentile_rank_series`, `weighted_ewma`, `run_rate`, `target_trajectory`</w:t>
+      </w:r>
+    </w:p>
+    <w:p>
+      <w:pPr>
+        <w:pStyle w:val="ListBullet"/>
+      </w:pPr>
+      <w:r>
+        <w:t>`forecast_confidence`, `seasonal_decompose`, `cohort_retention`, `survival_rate`</w:t>
       </w:r>
     </w:p>
     <w:p>
@@ -1227,7 +1307,7 @@
         <w:pStyle w:val="ListNumber"/>
       </w:pPr>
       <w:r>
-        <w:t>Model: reuse existing model or add config/models/&lt;id&gt;.yaml (physical or SQL).</w:t>
+        <w:t>Model: reuse existing model or add kpi_config/models/&lt;id&gt;.yaml (physical or SQL).</w:t>
       </w:r>
     </w:p>
     <w:p>
@@ -1235,7 +1315,7 @@
         <w:pStyle w:val="ListNumber"/>
       </w:pPr>
       <w:r>
-        <w:t>Copy template: cp config/kpis/3004.yaml config/kpis/&lt;kpi_id&gt;.yaml.</w:t>
+        <w:t>Copy template: cp kpi_config/kpis/sotif/3004.yaml kpi_config/kpis/&lt;kpi_group&gt;/&lt;kpi_id&gt;.yaml.</w:t>
       </w:r>
     </w:p>
     <w:p>
@@ -1251,7 +1331,7 @@
         <w:pStyle w:val="ListNumber"/>
       </w:pPr>
       <w:r>
-        <w:t>Align metadata: measures_required matches YAML; month filter = time.filter_code.</w:t>
+        <w:t>Align metadata: measures_required matches YAML; month filter = time.filter_code and/or time.periods.</w:t>
       </w:r>
     </w:p>
     <w:p>
@@ -1275,7 +1355,7 @@
         <w:pStyle w:val="ListNumber"/>
       </w:pPr>
       <w:r>
-        <w:t>Deploy: host module_path = udfs.kpi_engine.main (no per-KPI Python file).</w:t>
+        <w:t>Deploy: host module_path = kpi_engine.main (no per-KPI Python file).</w:t>
       </w:r>
     </w:p>
     <w:p>
@@ -1461,7 +1541,7 @@
           </w:tcPr>
           <w:p>
             <w:r>
-              <w:t>Catalog only, not core/</w:t>
+              <w:t>Catalog only, not pipeline/</w:t>
             </w:r>
           </w:p>
         </w:tc>
@@ -1513,7 +1593,7 @@
         <w:pStyle w:val="ListBullet"/>
       </w:pPr>
       <w:r>
-        <w:t>kpi_engine/core/ for a standard KPI.</w:t>
+        <w:t>kpi_engine/pipeline/ for a standard KPI.</w:t>
       </w:r>
     </w:p>
     <w:p>
@@ -1529,7 +1609,7 @@
         <w:pStyle w:val="ListBullet"/>
       </w:pPr>
       <w:r>
-        <w:t>Per-KPI UDF modules (udfs/&lt;kpi&gt;.py).</w:t>
+        <w:t>Per-KPI UDF modules.</w:t>
       </w:r>
     </w:p>
     <w:p>
@@ -1941,7 +2021,7 @@
         <w:pStyle w:val="ListBullet"/>
       </w:pPr>
       <w:r>
-        <w:t>New catalog name: capabilities/ + registries/ — not core/ edits.</w:t>
+        <w:t>New catalog name: capabilities/ + registries/ — not pipeline/ edits.</w:t>
       </w:r>
     </w:p>
     <w:p>
@@ -2395,6 +2475,14 @@
         <w:pStyle w:val="ListBullet"/>
       </w:pPr>
       <w:r>
+        <w:t>kpi-system-architecture.md — runtime flow and execution diagrams</w:t>
+      </w:r>
+    </w:p>
+    <w:p>
+      <w:pPr>
+        <w:pStyle w:val="ListBullet"/>
+      </w:pPr>
+      <w:r>
         <w:t>kpi-onboarding-guide.md — step-by-step onboarding playbook</w:t>
       </w:r>
     </w:p>
@@ -2403,7 +2491,15 @@
         <w:pStyle w:val="ListBullet"/>
       </w:pPr>
       <w:r>
-        <w:t>kpi-yaml-preparation-guide.md — YAML authoring, limits, when to use what</w:t>
+        <w:t>kpi-yaml-ai-prep.md — compact AI YAML authoring contract</w:t>
+      </w:r>
+    </w:p>
+    <w:p>
+      <w:pPr>
+        <w:pStyle w:val="ListBullet"/>
+      </w:pPr>
+      <w:r>
+        <w:t>kpi-yaml-preparation-guide.md — human YAML authoring, limits, when to use what</w:t>
       </w:r>
     </w:p>
     <w:p>
@@ -2419,7 +2515,7 @@
         <w:pStyle w:val="ListBullet"/>
       </w:pPr>
       <w:r>
-        <w:t>udfs/kpi_engine/registries/CAPABILITIES.md — live capability catalog</w:t>
+        <w:t>kpi_engine/registries/CAPABILITIES.md — live capability catalog</w:t>
       </w:r>
     </w:p>
     <w:p>
@@ -2435,7 +2531,7 @@
         <w:rPr>
           <w:b w:val="0"/>
         </w:rPr>
-        <w:t>Document generated 2026-08-25.</w:t>
+        <w:t>Document generated 2026-08-27.</w:t>
       </w:r>
     </w:p>
     <w:sectPr>

</xml_diff>